<commit_message>
Notes: reference fault-file version 45.4
- Fault File Notes: recommend the 45.4 format.
- Run File Notes, Line 2: version example is now (e.g., 45.3 or 45.4).
Both highlighted as changes from HAZ45.3.

Co-Authored-By: Claude Opus 5.5 <noreply@anthropic.com>
Claude-Session: https://claude.ai/code/session_012hqFBNE5nDByFb9nHZs7cc
</commit_message>
<xml_diff>
--- a/docs/HAZ-45.4 Notes.docx
+++ b/docs/HAZ-45.4 Notes.docx
@@ -1532,7 +1532,16 @@
         <w:t xml:space="preserve"> versions of fault files, it is recommended that users update to </w:t>
       </w:r>
       <w:r>
-        <w:t>the 45.3 format described below.</w:t>
+        <w:t xml:space="preserve">the </w:t>
+      </w:r>
+      <w:r>
+        <w:rPr>
+          <w:highlight w:val="yellow"/>
+        </w:rPr>
+        <w:t>45.4</w:t>
+      </w:r>
+      <w:r>
+        <w:t xml:space="preserve"> format described below.</w:t>
       </w:r>
     </w:p>
     <w:p>
@@ -8034,9 +8043,10 @@
       </w:r>
       <w:r>
         <w:rPr>
-          <w:lang w:val="en-US"/>
-        </w:rPr>
-        <w:t>(e.g., 45.2 or 45.3)</w:t>
+          <w:highlight w:val="yellow"/>
+          <w:lang w:val="en-US"/>
+        </w:rPr>
+        <w:t>(e.g., 45.3 or 45.4)</w:t>
       </w:r>
     </w:p>
     <w:p>

</xml_diff>

<commit_message>
Notes: document the two max distances; footer date XXX 2026
- Fault File Notes, Line 8: add the max distance type (1 or 2) after
  the source type, with a description (45.4 fault files only).
- Run File Notes, Line 4: maxdist1, maxdist2 for max distance types 1
  and 2; a single value applies to all sources.
- New text highlighted as changes from HAZ45.3.
- Footers: date changed from March 2023 to XXX 2026.

Co-Authored-By: Claude Opus 5.5 <noreply@anthropic.com>
Claude-Session: https://claude.ai/code/session_012hqFBNE5nDByFb9nHZs7cc
</commit_message>
<xml_diff>
--- a/docs/HAZ-45.4 Notes.docx
+++ b/docs/HAZ-45.4 Notes.docx
@@ -2224,6 +2224,7 @@
           <w:tab w:val="left" w:pos="1440"/>
         </w:tabs>
         <w:spacing w:line="240" w:lineRule="auto"/>
+        <w:ind w:left="2160" w:hanging="2160"/>
         <w:contextualSpacing/>
       </w:pPr>
       <w:r>
@@ -2243,7 +2244,20 @@
         <w:rPr>
           <w:i/>
         </w:rPr>
-        <w:t xml:space="preserve">Source type, Atten Type, sample step (km), </w:t>
+        <w:t xml:space="preserve">Source type, </w:t>
+      </w:r>
+      <w:r>
+        <w:rPr>
+          <w:i/>
+          <w:highlight w:val="yellow"/>
+        </w:rPr>
+        <w:t>Max distance type,</w:t>
+      </w:r>
+      <w:r>
+        <w:rPr>
+          <w:i/>
+        </w:rPr>
+        <w:t xml:space="preserve"> Atten Type, sample step (km), </w:t>
       </w:r>
       <w:proofErr w:type="spellStart"/>
       <w:r>
@@ -2439,6 +2453,40 @@
       <w:r>
         <w:tab/>
       </w:r>
+    </w:p>
+    <w:p>
+      <w:pPr>
+        <w:tabs>
+          <w:tab w:val="left" w:pos="720"/>
+          <w:tab w:val="left" w:pos="1440"/>
+        </w:tabs>
+        <w:spacing w:line="240" w:lineRule="auto"/>
+        <w:ind w:left="2160" w:hanging="2160"/>
+        <w:contextualSpacing/>
+      </w:pPr>
+      <w:r>
+        <w:tab/>
+        <w:tab/>
+        <w:tab/>
+        <w:tab/>
+      </w:r>
+      <w:r>
+        <w:rPr>
+          <w:highlight w:val="yellow"/>
+        </w:rPr>
+        <w:t xml:space="preserve">The max distance type selects which of the two maximum distances given in the run file (Line 4) is applied to this source: 1 for the first maximum distance and 2 for the second. For example, for the CEUS SSC model, RLME sources can be assigned max distance type 1 (1000 km) and distributed seismicity sources max distance type 2 (640 km). This input is only read for fault file version 45.4; all sources in earlier fault file versions use max distance type 1.</w:t>
+      </w:r>
+    </w:p>
+    <w:p>
+      <w:pPr>
+        <w:tabs>
+          <w:tab w:val="left" w:pos="720"/>
+          <w:tab w:val="left" w:pos="1440"/>
+        </w:tabs>
+        <w:spacing w:line="240" w:lineRule="auto"/>
+        <w:ind w:left="2160" w:hanging="2160"/>
+        <w:contextualSpacing/>
+      </w:pPr>
     </w:p>
     <w:p>
       <w:pPr>
@@ -8397,9 +8445,10 @@
       <w:r>
         <w:rPr>
           <w:i/>
-          <w:lang w:val="en-US"/>
-        </w:rPr>
-        <w:t>maxdist</w:t>
+          <w:highlight w:val="yellow"/>
+          <w:lang w:val="en-US"/>
+        </w:rPr>
+        <w:t>maxdist1, maxdist2</w:t>
       </w:r>
       <w:proofErr w:type="spellEnd"/>
       <w:r>
@@ -8429,6 +8478,13 @@
           <w:lang w:val="en-US"/>
         </w:rPr>
         <w:t xml:space="preserve">Maximum distance used in the analysis. Sources which are beyond this distance are not used in the analysis even if they are defined in the fault file. </w:t>
+      </w:r>
+      <w:r>
+        <w:rPr>
+          <w:highlight w:val="yellow"/>
+          <w:lang w:val="en-US"/>
+        </w:rPr>
+        <w:t xml:space="preserve">Two values may be given: maxdist1 is applied to sources with max distance type 1 and maxdist2 to sources with max distance type 2 (see Fault File Notes, Line 8). If only one value is given, it is applied to all sources. Sources in fault files before version 45.4 use maxdist1.</w:t>
       </w:r>
     </w:p>
     <w:p>
@@ -19366,10 +19422,7 @@
     </w:r>
     <w:r>
       <w:tab/>
-      <w:t>March 202</w:t>
-    </w:r>
-    <w:r>
-      <w:t>3</w:t>
+      <w:t>XXX 2026</w:t>
     </w:r>
   </w:p>
 </w:ftr>
@@ -19445,10 +19498,7 @@
     </w:r>
     <w:r>
       <w:tab/>
-      <w:t>March 202</w:t>
-    </w:r>
-    <w:r>
-      <w:t>3</w:t>
+      <w:t>XXX 2026</w:t>
     </w:r>
   </w:p>
 </w:ftr>
@@ -19605,7 +19655,7 @@
       <w:tab/>
     </w:r>
     <w:r>
-      <w:t>March 2023</w:t>
+      <w:t>XXX 2026</w:t>
     </w:r>
   </w:p>
 </w:ftr>

</xml_diff>